<commit_message>
final tidy: per-connection limit explanation, small wording fixes, package.json scripts, readme
Co-Authored-By: Claude Opus 5.5 <noreply@anthropic.com>
</commit_message>
<xml_diff>
--- a/SIT314_Distinction_Revision_Sheet.docx
+++ b/SIT314_Distinction_Revision_Sheet.docx
@@ -383,7 +383,7 @@
           <w:sz w:val="19"/>
           <w:szCs w:val="19"/>
         </w:rPr>
-        <w:t xml:space="preserve">Node-RED has ONE MQTT connection; at 100 rooms it was receiving ~100 msg/s = IoT Core's per-connection limit → PublishOut.Throttle 214 → late/out-of-order delivery → my dedupe dropped 721 as "duplicate/old" + 306 as &gt;60 s late. CPU was fine (~1%).</w:t>
+        <w:t xml:space="preserve">IoT Core allows 100 publishes/s PER CONNECTION (in and out) and discards the rest. Node-RED has ONE connection and was getting just over 100 msg/s → 214 discarded (PublishOut.Throttle) + late/out-of-order delivery → my dedupe dropped 1,017 load readings. 214 + 1,017 = 1,231 of the 1,248 missing. CPU was fine (~1%).</w:t>
       </w:r>
     </w:p>
     <w:p>
@@ -671,7 +671,7 @@
           <w:sz w:val="19"/>
           <w:szCs w:val="19"/>
         </w:rPr>
-        <w:t xml:space="preserve">A: Lambda dropped 0 events (just delayed them), but 6% of load readings never got saved – Node-RED's single connection got throttled by IoT Core and my strict dedupe threw away late/out-of-order messages.</w:t>
+        <w:t xml:space="preserve">A: Lambda dropped 0 events (just delayed them), but 6% of load readings never got saved – Node-RED's single connection went over IoT Core's 100 msg/s per-connection limit (214 discarded) and my strict dedupe threw away 1,017 late/out-of-order ones.</w:t>
       </w:r>
     </w:p>
     <w:p>

</xml_diff>